<commit_message>
Finished analysing photosynthetic probability
</commit_message>
<xml_diff>
--- a/Tables/Table_1.docx
+++ b/Tables/Table_1.docx
@@ -29,17 +29,17 @@
               <w:pStyle w:val="Normal"/>
             </w:pPr>
             <w:r>
-              <w:t>P</w:t>
-            </w:r>
-          </w:p>
-        </w:tc>
-        <w:tc>
-          <w:p>
-            <w:pPr>
-              <w:pStyle w:val="Normal"/>
-            </w:pPr>
-            <w:r>
-              <w:t>P_alpha</w:t>
+              <w:t>P_k_tau</w:t>
+            </w:r>
+          </w:p>
+        </w:tc>
+        <w:tc>
+          <w:p>
+            <w:pPr>
+              <w:pStyle w:val="Normal"/>
+            </w:pPr>
+            <w:r>
+              <w:t>P_mu_k</w:t>
             </w:r>
           </w:p>
         </w:tc>
@@ -79,6 +79,16 @@
               <w:pStyle w:val="Normal"/>
             </w:pPr>
             <w:r>
+              <w:t>mu</w:t>
+            </w:r>
+          </w:p>
+        </w:tc>
+        <w:tc>
+          <w:p>
+            <w:pPr>
+              <w:pStyle w:val="Normal"/>
+            </w:pPr>
+            <w:r>
               <w:t>t0.5_k</w:t>
             </w:r>
           </w:p>
@@ -99,7 +109,17 @@
               <w:pStyle w:val="Normal"/>
             </w:pPr>
             <w:r>
-              <w:t>t0.5_diff</w:t>
+              <w:t>k_tau_diff</w:t>
+            </w:r>
+          </w:p>
+        </w:tc>
+        <w:tc>
+          <w:p>
+            <w:pPr>
+              <w:pStyle w:val="Normal"/>
+            </w:pPr>
+            <w:r>
+              <w:t>mu_k_diff</w:t>
             </w:r>
           </w:p>
         </w:tc>
@@ -131,7 +151,7 @@
               <w:pStyle w:val="Normal"/>
             </w:pPr>
             <w:r>
-              <w:t>0.4000</w:t>
+              <w:t>0.81</w:t>
             </w:r>
           </w:p>
         </w:tc>
@@ -171,6 +191,16 @@
               <w:pStyle w:val="Normal"/>
             </w:pPr>
             <w:r>
+              <w:t>57 ± 35 (50)</w:t>
+            </w:r>
+          </w:p>
+        </w:tc>
+        <w:tc>
+          <w:p>
+            <w:pPr>
+              <w:pStyle w:val="Normal"/>
+            </w:pPr>
+            <w:r>
               <w:t>86 ± 1300 (12)</w:t>
             </w:r>
           </w:p>
@@ -192,6 +222,16 @@
             </w:pPr>
             <w:r>
               <w:t>73 ± 1300 (0.07)</w:t>
+            </w:r>
+          </w:p>
+        </w:tc>
+        <w:tc>
+          <w:p>
+            <w:pPr>
+              <w:pStyle w:val="Normal"/>
+            </w:pPr>
+            <w:r>
+              <w:t>-29 ± 1300 (33)</w:t>
             </w:r>
           </w:p>
         </w:tc>
@@ -223,7 +263,7 @@
               <w:pStyle w:val="Normal"/>
             </w:pPr>
             <w:r>
-              <w:t>0.0190</w:t>
+              <w:t>0.95</w:t>
             </w:r>
           </w:p>
         </w:tc>
@@ -263,6 +303,16 @@
               <w:pStyle w:val="Normal"/>
             </w:pPr>
             <w:r>
+              <w:t>66 ± 15 (65)</w:t>
+            </w:r>
+          </w:p>
+        </w:tc>
+        <w:tc>
+          <w:p>
+            <w:pPr>
+              <w:pStyle w:val="Normal"/>
+            </w:pPr>
+            <w:r>
               <w:t>28 ± 21 (24)</w:t>
             </w:r>
           </w:p>
@@ -284,6 +334,16 @@
             </w:pPr>
             <w:r>
               <w:t>16 ± 21 (12)</w:t>
+            </w:r>
+          </w:p>
+        </w:tc>
+        <w:tc>
+          <w:p>
+            <w:pPr>
+              <w:pStyle w:val="Normal"/>
+            </w:pPr>
+            <w:r>
+              <w:t>38 ± 25 (40)</w:t>
             </w:r>
           </w:p>
         </w:tc>
@@ -315,7 +375,7 @@
               <w:pStyle w:val="Normal"/>
             </w:pPr>
             <w:r>
-              <w:t>0.2800</w:t>
+              <w:t>0.80</w:t>
             </w:r>
           </w:p>
         </w:tc>
@@ -355,6 +415,16 @@
               <w:pStyle w:val="Normal"/>
             </w:pPr>
             <w:r>
+              <w:t>94 ± 21 (92)</w:t>
+            </w:r>
+          </w:p>
+        </w:tc>
+        <w:tc>
+          <w:p>
+            <w:pPr>
+              <w:pStyle w:val="Normal"/>
+            </w:pPr>
+            <w:r>
               <w:t>68 ± 47 (59)</w:t>
             </w:r>
           </w:p>
@@ -376,6 +446,16 @@
             </w:pPr>
             <w:r>
               <w:t>52 ± 47 (43)</w:t>
+            </w:r>
+          </w:p>
+        </w:tc>
+        <w:tc>
+          <w:p>
+            <w:pPr>
+              <w:pStyle w:val="Normal"/>
+            </w:pPr>
+            <w:r>
+              <w:t>26 ± 52 (33)</w:t>
             </w:r>
           </w:p>
         </w:tc>
@@ -407,7 +487,7 @@
               <w:pStyle w:val="Normal"/>
             </w:pPr>
             <w:r>
-              <w:t>0.0290</w:t>
+              <w:t>0.88</w:t>
             </w:r>
           </w:p>
         </w:tc>
@@ -447,6 +527,16 @@
               <w:pStyle w:val="Normal"/>
             </w:pPr>
             <w:r>
+              <w:t>32 ± 7.8 (31)</w:t>
+            </w:r>
+          </w:p>
+        </w:tc>
+        <w:tc>
+          <w:p>
+            <w:pPr>
+              <w:pStyle w:val="Normal"/>
+            </w:pPr>
+            <w:r>
               <w:t>19 ± 17 (16)</w:t>
             </w:r>
           </w:p>
@@ -468,6 +558,16 @@
             </w:pPr>
             <w:r>
               <w:t>10 ± 17 (7.4)</w:t>
+            </w:r>
+          </w:p>
+        </w:tc>
+        <w:tc>
+          <w:p>
+            <w:pPr>
+              <w:pStyle w:val="Normal"/>
+            </w:pPr>
+            <w:r>
+              <w:t>13 ± 19 (14)</w:t>
             </w:r>
           </w:p>
         </w:tc>
@@ -499,7 +599,7 @@
               <w:pStyle w:val="Normal"/>
             </w:pPr>
             <w:r>
-              <w:t>0.0012</w:t>
+              <w:t>0.89</w:t>
             </w:r>
           </w:p>
         </w:tc>
@@ -539,6 +639,16 @@
               <w:pStyle w:val="Normal"/>
             </w:pPr>
             <w:r>
+              <w:t>26 ± 6.2 (26)</w:t>
+            </w:r>
+          </w:p>
+        </w:tc>
+        <w:tc>
+          <w:p>
+            <w:pPr>
+              <w:pStyle w:val="Normal"/>
+            </w:pPr>
+            <w:r>
               <w:t>16 ± 13 (13)</w:t>
             </w:r>
           </w:p>
@@ -560,6 +670,16 @@
             </w:pPr>
             <w:r>
               <w:t>8.4 ± 13 (5.9)</w:t>
+            </w:r>
+          </w:p>
+        </w:tc>
+        <w:tc>
+          <w:p>
+            <w:pPr>
+              <w:pStyle w:val="Normal"/>
+            </w:pPr>
+            <w:r>
+              <w:t>11 ± 14 (13)</w:t>
             </w:r>
           </w:p>
         </w:tc>

</xml_diff>

<commit_message>
Continued work on animations and started analysing NMDS
</commit_message>
<xml_diff>
--- a/Tables/Table_1.docx
+++ b/Tables/Table_1.docx
@@ -151,7 +151,7 @@
               <w:pStyle w:val="Normal"/>
             </w:pPr>
             <w:r>
-              <w:t>0.81</w:t>
+              <w:t>0.50</w:t>
             </w:r>
           </w:p>
         </w:tc>
@@ -191,7 +191,7 @@
               <w:pStyle w:val="Normal"/>
             </w:pPr>
             <w:r>
-              <w:t>57 ± 35 (50)</w:t>
+              <w:t>110 ± 3700 (12)</w:t>
             </w:r>
           </w:p>
         </w:tc>
@@ -231,7 +231,7 @@
               <w:pStyle w:val="Normal"/>
             </w:pPr>
             <w:r>
-              <w:t>-29 ± 1300 (33)</w:t>
+              <w:t>27 ± 4000 (0.023)</w:t>
             </w:r>
           </w:p>
         </w:tc>
@@ -303,7 +303,7 @@
               <w:pStyle w:val="Normal"/>
             </w:pPr>
             <w:r>
-              <w:t>66 ± 15 (65)</w:t>
+              <w:t>66 ± 16 (65)</w:t>
             </w:r>
           </w:p>
         </w:tc>
@@ -343,7 +343,7 @@
               <w:pStyle w:val="Normal"/>
             </w:pPr>
             <w:r>
-              <w:t>38 ± 25 (40)</w:t>
+              <w:t>38 ± 26 (40)</w:t>
             </w:r>
           </w:p>
         </w:tc>
@@ -415,7 +415,7 @@
               <w:pStyle w:val="Normal"/>
             </w:pPr>
             <w:r>
-              <w:t>94 ± 21 (92)</w:t>
+              <w:t>96 ± 24 (93)</w:t>
             </w:r>
           </w:p>
         </w:tc>
@@ -455,7 +455,7 @@
               <w:pStyle w:val="Normal"/>
             </w:pPr>
             <w:r>
-              <w:t>26 ± 52 (33)</w:t>
+              <w:t>28 ± 53 (34)</w:t>
             </w:r>
           </w:p>
         </w:tc>
@@ -487,7 +487,7 @@
               <w:pStyle w:val="Normal"/>
             </w:pPr>
             <w:r>
-              <w:t>0.88</w:t>
+              <w:t>0.87</w:t>
             </w:r>
           </w:p>
         </w:tc>
@@ -527,7 +527,7 @@
               <w:pStyle w:val="Normal"/>
             </w:pPr>
             <w:r>
-              <w:t>32 ± 7.8 (31)</w:t>
+              <w:t>31 ± 8 (30)</w:t>
             </w:r>
           </w:p>
         </w:tc>
@@ -567,7 +567,7 @@
               <w:pStyle w:val="Normal"/>
             </w:pPr>
             <w:r>
-              <w:t>13 ± 19 (14)</w:t>
+              <w:t>12 ± 19 (14)</w:t>
             </w:r>
           </w:p>
         </w:tc>
@@ -599,7 +599,7 @@
               <w:pStyle w:val="Normal"/>
             </w:pPr>
             <w:r>
-              <w:t>0.89</w:t>
+              <w:t>0.88</w:t>
             </w:r>
           </w:p>
         </w:tc>
@@ -639,7 +639,7 @@
               <w:pStyle w:val="Normal"/>
             </w:pPr>
             <w:r>
-              <w:t>26 ± 6.2 (26)</w:t>
+              <w:t>26 ± 6.4 (25)</w:t>
             </w:r>
           </w:p>
         </w:tc>
@@ -679,7 +679,7 @@
               <w:pStyle w:val="Normal"/>
             </w:pPr>
             <w:r>
-              <w:t>11 ± 14 (13)</w:t>
+              <w:t>10 ± 14 (12)</w:t>
             </w:r>
           </w:p>
         </w:tc>

</xml_diff>